<commit_message>
Actualiza plan de fases de matrices
</commit_message>
<xml_diff>
--- a/docs/3. Módulo Matrices de Riesgos/Plan_Fases_Modulo_3_Matrices_Riesgos_SGRLA_IHSS.docx
+++ b/docs/3. Módulo Matrices de Riesgos/Plan_Fases_Modulo_3_Matrices_Riesgos_SGRLA_IHSS.docx
@@ -149,10 +149,7 @@
         <w:t xml:space="preserve">Alcance: </w:t>
       </w:r>
       <w:r>
-        <w:t>Definir todas las fases necesarias para diseñar, construir, validar y preparar el m</w:t>
-      </w:r>
-      <w:r>
-        <w:t>ódulo Matrices de Riesgos.</w:t>
+        <w:t>Definir todas las fases necesarias para diseñar, construir, validar y preparar el módulo Matrices de Riesgos.</w:t>
       </w:r>
     </w:p>
     <w:p>
@@ -172,10 +169,7 @@
     </w:p>
     <w:p>
       <w:r>
-        <w:t>Este documento define todas las fases de trabajo necesarias para construir el Módulo 3. Matrices de Riesgos del Sistema de Gestión de Riesgos LAFT del IHSS. El módulo debe entenderse como un motor meto</w:t>
-      </w:r>
-      <w:r>
-        <w:t>dológico, cuantitativo, cualitativo, versionado, trazable y auditable; no como una pantalla aislada.</w:t>
+        <w:t>Este documento define todas las fases de trabajo necesarias para construir el Módulo 3. Matrices de Riesgos del Sistema de Gestión de Riesgos LAFT del IHSS. El módulo debe entenderse como un motor metodológico, cuantitativo, cualitativo, versionado, trazable y auditable; no como una pantalla aislada.</w:t>
       </w:r>
     </w:p>
     <w:tbl>
@@ -232,14 +226,7 @@
                 <w:color w:val="2D2D2D"/>
                 <w:sz w:val="20"/>
               </w:rPr>
-              <w:t xml:space="preserve">Monitoreo de Listas detecta y documenta casos. Matrices de Riesgos mide, calcula, mitiga, explica y da seguimiento al riesgo LAFT mediante </w:t>
-            </w:r>
-            <w:r>
-              <w:rPr>
-                <w:color w:val="2D2D2D"/>
-                <w:sz w:val="20"/>
-              </w:rPr>
-              <w:t>metodología aprobada, cálculos versionados, controles y planes de acción.</w:t>
+              <w:t>Monitoreo de Listas detecta y documenta casos. Matrices de Riesgos mide, calcula, mitiga, explica y da seguimiento al riesgo LAFT mediante metodología aprobada, cálculos versionados, controles y planes de acción.</w:t>
             </w:r>
           </w:p>
         </w:tc>
@@ -271,10 +258,7 @@
         <w:pStyle w:val="Listaconvietas"/>
       </w:pPr>
       <w:r>
-        <w:t xml:space="preserve">Parametrizar factores, </w:t>
-      </w:r>
-      <w:r>
-        <w:t>criterios, escalas y ponderaciones por versión metodológica.</w:t>
+        <w:t>Parametrizar factores, criterios, escalas y ponderaciones por versión metodológica.</w:t>
       </w:r>
     </w:p>
     <w:p>
@@ -290,10 +274,7 @@
         <w:pStyle w:val="Listaconvietas"/>
       </w:pPr>
       <w:r>
-        <w:t>Registrar controles, evidencias, planes de acción, historial funcional y au</w:t>
-      </w:r>
-      <w:r>
-        <w:t>ditoría transversal.</w:t>
+        <w:t>Registrar controles, evidencias, planes de acción, historial funcional y auditoría transversal.</w:t>
       </w:r>
     </w:p>
     <w:p>
@@ -417,15 +398,7 @@
                 <w:color w:val="142334"/>
                 <w:sz w:val="19"/>
               </w:rPr>
-              <w:t>Just</w:t>
-            </w:r>
-            <w:r>
-              <w:rPr>
-                <w:b/>
-                <w:color w:val="142334"/>
-                <w:sz w:val="19"/>
-              </w:rPr>
-              <w:t>ificación</w:t>
+              <w:t>Justificación</w:t>
             </w:r>
           </w:p>
         </w:tc>
@@ -647,14 +620,7 @@
                 <w:color w:val="1E1E1E"/>
                 <w:sz w:val="18"/>
               </w:rPr>
-              <w:t xml:space="preserve">Contrato explícito para backend y </w:t>
-            </w:r>
-            <w:r>
-              <w:rPr>
-                <w:color w:val="1E1E1E"/>
-                <w:sz w:val="18"/>
-              </w:rPr>
-              <w:t>frontend.</w:t>
+              <w:t>Contrato explícito para backend y frontend.</w:t>
             </w:r>
           </w:p>
         </w:tc>
@@ -876,14 +842,7 @@
                 <w:color w:val="1E1E1E"/>
                 <w:sz w:val="18"/>
               </w:rPr>
-              <w:t>Bitácora transversal más</w:t>
-            </w:r>
-            <w:r>
-              <w:rPr>
-                <w:color w:val="1E1E1E"/>
-                <w:sz w:val="18"/>
-              </w:rPr>
-              <w:t xml:space="preserve"> historial funcional propio.</w:t>
+              <w:t>Bitácora transversal más historial funcional propio.</w:t>
             </w:r>
           </w:p>
         </w:tc>
@@ -1122,14 +1081,7 @@
                 <w:color w:val="1E1E1E"/>
                 <w:sz w:val="18"/>
               </w:rPr>
-              <w:t xml:space="preserve">Gobierno, alcance y control </w:t>
-            </w:r>
-            <w:r>
-              <w:rPr>
-                <w:color w:val="1E1E1E"/>
-                <w:sz w:val="18"/>
-              </w:rPr>
-              <w:t>documental</w:t>
+              <w:t>Gobierno, alcance y control documental</w:t>
             </w:r>
           </w:p>
         </w:tc>
@@ -1227,14 +1179,7 @@
                 <w:color w:val="1E1E1E"/>
                 <w:sz w:val="18"/>
               </w:rPr>
-              <w:t xml:space="preserve">Convertir el requerimiento funcional en una </w:t>
-            </w:r>
-            <w:r>
-              <w:rPr>
-                <w:color w:val="1E1E1E"/>
-                <w:sz w:val="18"/>
-              </w:rPr>
-              <w:t>metodología operativa, medible, versionable y aprobable antes de diseñar pantallas o tablas definitivas.</w:t>
+              <w:t>Convertir el requerimiento funcional en una metodología operativa, medible, versionable y aprobable antes de diseñar pantallas o tablas definitivas.</w:t>
             </w:r>
           </w:p>
         </w:tc>
@@ -1456,14 +1401,7 @@
                 <w:color w:val="1E1E1E"/>
                 <w:sz w:val="18"/>
               </w:rPr>
-              <w:t>Definir la A</w:t>
-            </w:r>
-            <w:r>
-              <w:rPr>
-                <w:color w:val="1E1E1E"/>
-                <w:sz w:val="18"/>
-              </w:rPr>
-              <w:t>PI y los contratos técnicos que sostendrán cálculo, validación, permisos, auditoría y reportes.</w:t>
+              <w:t>Definir la API y los contratos técnicos que sostendrán cálculo, validación, permisos, auditoría y reportes.</w:t>
             </w:r>
           </w:p>
         </w:tc>
@@ -1537,14 +1475,7 @@
                 <w:color w:val="1E1E1E"/>
                 <w:sz w:val="18"/>
               </w:rPr>
-              <w:t xml:space="preserve">Construir el núcleo metodológico que calcula riesgo inherente, mitigación por controles y riesgo residual de forma </w:t>
-            </w:r>
-            <w:r>
-              <w:rPr>
-                <w:color w:val="1E1E1E"/>
-                <w:sz w:val="18"/>
-              </w:rPr>
-              <w:t>trazable y repetible.</w:t>
+              <w:t>Construir el núcleo metodológico que calcula riesgo inherente, mitigación por controles y riesgo residual de forma trazable y repetible.</w:t>
             </w:r>
           </w:p>
         </w:tc>
@@ -1692,14 +1623,7 @@
                 <w:color w:val="1E1E1E"/>
                 <w:sz w:val="18"/>
               </w:rPr>
-              <w:t>Implementar la interfaz del</w:t>
-            </w:r>
-            <w:r>
-              <w:rPr>
-                <w:color w:val="1E1E1E"/>
-                <w:sz w:val="18"/>
-              </w:rPr>
-              <w:t xml:space="preserve"> módulo con rutas protegidas, formularios validados, navegación clara y consumo correcto de API.</w:t>
+              <w:t>Implementar la interfaz del módulo con rutas protegidas, formularios validados, navegación clara y consumo correcto de API.</w:t>
             </w:r>
           </w:p>
         </w:tc>
@@ -1773,14 +1697,7 @@
                 <w:color w:val="1E1E1E"/>
                 <w:sz w:val="18"/>
               </w:rPr>
-              <w:t>Entregar consultas ejecutivas y operativas para seguimiento del riesgo, resultados históricos y evidencias de</w:t>
-            </w:r>
-            <w:r>
-              <w:rPr>
-                <w:color w:val="1E1E1E"/>
-                <w:sz w:val="18"/>
-              </w:rPr>
-              <w:t xml:space="preserve"> gestión.</w:t>
+              <w:t>Entregar consultas ejecutivas y operativas para seguimiento del riesgo, resultados históricos y evidencias de gestión.</w:t>
             </w:r>
           </w:p>
         </w:tc>
@@ -1929,14 +1846,7 @@
                 <w:color w:val="1E1E1E"/>
                 <w:sz w:val="18"/>
               </w:rPr>
-              <w:t xml:space="preserve">Validar </w:t>
-            </w:r>
-            <w:r>
-              <w:rPr>
-                <w:color w:val="1E1E1E"/>
-                <w:sz w:val="18"/>
-              </w:rPr>
-              <w:t>funcionamiento, seguridad, consistencia de datos, auditoría, rendimiento básico y experiencia de usuario antes de cierre.</w:t>
+              <w:t>Validar funcionamiento, seguridad, consistencia de datos, auditoría, rendimiento básico y experiencia de usuario antes de cierre.</w:t>
             </w:r>
           </w:p>
         </w:tc>
@@ -2010,14 +1920,7 @@
                 <w:color w:val="1E1E1E"/>
                 <w:sz w:val="18"/>
               </w:rPr>
-              <w:t>Dejar el módulo listo para revisión institucional, transferencia y continuida</w:t>
-            </w:r>
-            <w:r>
-              <w:rPr>
-                <w:color w:val="1E1E1E"/>
-                <w:sz w:val="18"/>
-              </w:rPr>
-              <w:t>d operativa.</w:t>
+              <w:t>Dejar el módulo listo para revisión institucional, transferencia y continuidad operativa.</w:t>
             </w:r>
           </w:p>
         </w:tc>
@@ -2090,10 +1993,7 @@
         <w:pStyle w:val="Listaconvietas"/>
       </w:pPr>
       <w:r>
-        <w:t>Clasifi</w:t>
-      </w:r>
-      <w:r>
-        <w:t>car documentos como cliente, desarrollador, técnico transversal o evidencia de pruebas.</w:t>
+        <w:t>Clasificar documentos como cliente, desarrollador, técnico transversal o evidencia de pruebas.</w:t>
       </w:r>
     </w:p>
     <w:p>
@@ -2133,10 +2033,7 @@
         <w:pStyle w:val="Listaconvietas"/>
       </w:pPr>
       <w:r>
-        <w:t>Inventario documental</w:t>
-      </w:r>
-      <w:r>
-        <w:t xml:space="preserve"> controlado del módulo.</w:t>
+        <w:t>Inventario documental controlado del módulo.</w:t>
       </w:r>
     </w:p>
     <w:p>
@@ -2176,10 +2073,7 @@
         <w:pStyle w:val="Listaconvietas"/>
       </w:pPr>
       <w:r>
-        <w:t>No exi</w:t>
-      </w:r>
-      <w:r>
-        <w:t>sten borradores, duplicados ni temporales dentro de la carpeta del módulo.</w:t>
+        <w:t>No existen borradores, duplicados ni temporales dentro de la carpeta del módulo.</w:t>
       </w:r>
     </w:p>
     <w:p>
@@ -2208,14 +2102,7 @@
           <w:b/>
           <w:color w:val="142334"/>
         </w:rPr>
-        <w:t>Convertir el requerimiento funcional en una metodología</w:t>
-      </w:r>
-      <w:r>
-        <w:rPr>
-          <w:b/>
-          <w:color w:val="142334"/>
-        </w:rPr>
-        <w:t xml:space="preserve"> operativa, medible, versionable y aprobable antes de diseñar pantallas o tablas definitivas.</w:t>
+        <w:t>Convertir el requerimiento funcional en una metodología operativa, medible, versionable y aprobable antes de diseñar pantallas o tablas definitivas.</w:t>
       </w:r>
     </w:p>
     <w:p>
@@ -2240,10 +2127,7 @@
       </w:pPr>
       <w:r>
         <w:lastRenderedPageBreak/>
-        <w:t>Definir variables, c</w:t>
-      </w:r>
-      <w:r>
-        <w:t>riterios, escalas, pesos, rangos y reglas de obligatoriedad.</w:t>
+        <w:t>Definir variables, criterios, escalas, pesos, rangos y reglas de obligatoriedad.</w:t>
       </w:r>
     </w:p>
     <w:p>
@@ -2267,10 +2151,7 @@
         <w:pStyle w:val="Listaconvietas"/>
       </w:pPr>
       <w:r>
-        <w:t>Definir qué información puede provenir</w:t>
-      </w:r>
-      <w:r>
-        <w:t xml:space="preserve"> de fuentes internas y qué datos serán capturados por el usuario.</w:t>
+        <w:t>Definir qué información puede provenir de fuentes internas y qué datos serán capturados por el usuario.</w:t>
       </w:r>
     </w:p>
     <w:p>
@@ -2280,8 +2161,6 @@
       <w:r>
         <w:t>Entregables</w:t>
       </w:r>
-      <w:bookmarkStart w:id="0" w:name="_GoBack"/>
-      <w:bookmarkEnd w:id="0"/>
     </w:p>
     <w:p>
       <w:pPr>
@@ -2312,10 +2191,7 @@
         <w:pStyle w:val="Listaconvietas"/>
       </w:pPr>
       <w:r>
-        <w:t>Criterios para riesgo alto o crítico y plan de acción obl</w:t>
-      </w:r>
-      <w:r>
-        <w:t>igatorio.</w:t>
+        <w:t>Criterios para riesgo alto o crítico y plan de acción obligatorio.</w:t>
       </w:r>
     </w:p>
     <w:p>
@@ -2359,14 +2235,7 @@
           <w:i/>
           <w:color w:val="595959"/>
         </w:rPr>
-        <w:t xml:space="preserve">Dependencia principal: </w:t>
-      </w:r>
-      <w:r>
-        <w:rPr>
-          <w:i/>
-          <w:color w:val="595959"/>
-        </w:rPr>
-        <w:t>Requerimiento del cliente y criterio de Cumplimiento/área responsable.</w:t>
+        <w:t>Dependencia principal: Requerimiento del cliente y criterio de Cumplimiento/área responsable.</w:t>
       </w:r>
     </w:p>
     <w:p>
@@ -2399,10 +2268,7 @@
         <w:pStyle w:val="Listaconvietas"/>
       </w:pPr>
       <w:r>
-        <w:t>Diseñar ta</w:t>
-      </w:r>
-      <w:r>
-        <w:t>blas RL_MR_* para modelos, factores, criterios, escalas, ponderaciones, matrices, detalle, resultados, controles, planes, evidencias e historial.</w:t>
+        <w:t>Diseñar tablas RL_MR_* para modelos, factores, criterios, escalas, ponderaciones, matrices, detalle, resultados, controles, planes, evidencias e historial.</w:t>
       </w:r>
     </w:p>
     <w:p>
@@ -2418,10 +2284,7 @@
         <w:pStyle w:val="Listaconvietas"/>
       </w:pPr>
       <w:r>
-        <w:t>Preparar scripts ide</w:t>
-      </w:r>
-      <w:r>
-        <w:t>mpotentes y clasificados como aprobados, utilitarios o experimentales.</w:t>
+        <w:t>Preparar scripts idempotentes y clasificados como aprobados, utilitarios o experimentales.</w:t>
       </w:r>
     </w:p>
     <w:p>
@@ -2461,10 +2324,7 @@
         <w:pStyle w:val="Listaconvietas"/>
       </w:pPr>
       <w:r>
-        <w:t>Script inicial de estructura RL_</w:t>
-      </w:r>
-      <w:r>
-        <w:t>MR_*.</w:t>
+        <w:t>Script inicial de estructura RL_MR_*.</w:t>
       </w:r>
     </w:p>
     <w:p>
@@ -2512,10 +2372,7 @@
         <w:pStyle w:val="Listaconvietas"/>
       </w:pPr>
       <w:r>
-        <w:t>Toda matriz cerrad</w:t>
-      </w:r>
-      <w:r>
-        <w:t>a queda protegida contra edición metodológica retroactiva.</w:t>
+        <w:t>Toda matriz cerrada queda protegida contra edición metodológica retroactiva.</w:t>
       </w:r>
     </w:p>
     <w:p>
@@ -2545,14 +2402,7 @@
           <w:b/>
           <w:color w:val="142334"/>
         </w:rPr>
-        <w:t>Diseñar las pantallas y flujos del módulo antes de construi</w:t>
-      </w:r>
-      <w:r>
-        <w:rPr>
-          <w:b/>
-          <w:color w:val="142334"/>
-        </w:rPr>
-        <w:t>r, garantizando separación entre operación, parametrización, evaluación y reportería.</w:t>
+        <w:t>Diseñar las pantallas y flujos del módulo antes de construir, garantizando separación entre operación, parametrización, evaluación y reportería.</w:t>
       </w:r>
     </w:p>
     <w:p>
@@ -2576,10 +2426,7 @@
         <w:pStyle w:val="Listaconvietas"/>
       </w:pPr>
       <w:r>
-        <w:t>Diseñar dashboard, listado, creación de matriz, evaluación, controles, planes d</w:t>
-      </w:r>
-      <w:r>
-        <w:t>e acción, historial y reportes.</w:t>
+        <w:t>Diseñar dashboard, listado, creación de matriz, evaluación, controles, planes de acción, historial y reportes.</w:t>
       </w:r>
     </w:p>
     <w:p>
@@ -2603,10 +2450,7 @@
         <w:pStyle w:val="Listaconvietas"/>
       </w:pPr>
       <w:r>
-        <w:t xml:space="preserve">Preparar textos funcionales, </w:t>
-      </w:r>
-      <w:r>
-        <w:t>validaciones visibles y mensajes de error.</w:t>
+        <w:t>Preparar textos funcionales, validaciones visibles y mensajes de error.</w:t>
       </w:r>
     </w:p>
     <w:p>
@@ -2662,10 +2506,7 @@
         <w:pStyle w:val="Listaconvietas"/>
       </w:pPr>
       <w:r>
-        <w:t xml:space="preserve">El flujo permite crear, calcular, revisar, </w:t>
-      </w:r>
-      <w:r>
-        <w:t>aprobar y consultar una matriz.</w:t>
+        <w:t>El flujo permite crear, calcular, revisar, aprobar y consultar una matriz.</w:t>
       </w:r>
     </w:p>
     <w:p>
@@ -2701,10 +2542,7 @@
         <w:pStyle w:val="Ttulo2"/>
       </w:pPr>
       <w:r>
-        <w:t>Fase 5. Contratos b</w:t>
-      </w:r>
-      <w:r>
-        <w:t>ackend, seguridad y auditoría</w:t>
+        <w:t>Fase 5. Contratos backend, seguridad y auditoría</w:t>
       </w:r>
     </w:p>
     <w:p>
@@ -2737,10 +2575,7 @@
         <w:pStyle w:val="Listaconvietas"/>
       </w:pPr>
       <w:r>
-        <w:t>Diseñar endpoints mínimos par</w:t>
-      </w:r>
-      <w:r>
-        <w:t>a dashboard, listado, detalle, creación, evaluación, cálculo, controles, planes, evidencias, aprobación y exportación.</w:t>
+        <w:t>Diseñar endpoints mínimos para dashboard, listado, detalle, creación, evaluación, cálculo, controles, planes, evidencias, aprobación y exportación.</w:t>
       </w:r>
     </w:p>
     <w:p>
@@ -2764,10 +2599,7 @@
         <w:pStyle w:val="Listaconvietas"/>
       </w:pPr>
       <w:r>
-        <w:t xml:space="preserve">Diseñar </w:t>
-      </w:r>
-      <w:r>
-        <w:t>respuestas estándar de éxito, error funcional y validación.</w:t>
+        <w:t>Diseñar respuestas estándar de éxito, error funcional y validación.</w:t>
       </w:r>
     </w:p>
     <w:p>
@@ -2824,10 +2656,7 @@
         <w:pStyle w:val="Listaconvietas"/>
       </w:pPr>
       <w:r>
-        <w:t>Todo end</w:t>
-      </w:r>
-      <w:r>
-        <w:t>point sensible exige autenticación y permiso modular.</w:t>
+        <w:t>Todo endpoint sensible exige autenticación y permiso modular.</w:t>
       </w:r>
     </w:p>
     <w:p>
@@ -2863,10 +2692,7 @@
         <w:pStyle w:val="Ttulo2"/>
       </w:pPr>
       <w:r>
-        <w:t>Fase 6. Motor de cál</w:t>
-      </w:r>
-      <w:r>
-        <w:t>culo y reglas de negocio</w:t>
+        <w:t>Fase 6. Motor de cálculo y reglas de negocio</w:t>
       </w:r>
     </w:p>
     <w:p>
@@ -2891,10 +2717,7 @@
         <w:pStyle w:val="Listaconvietas"/>
       </w:pPr>
       <w:r>
-        <w:t xml:space="preserve">Implementar validaciones de obligatoriedad, rangos, ponderaciones y </w:t>
-      </w:r>
-      <w:r>
-        <w:t>vigencia metodológica.</w:t>
+        <w:t>Implementar validaciones de obligatoriedad, rangos, ponderaciones y vigencia metodológica.</w:t>
       </w:r>
     </w:p>
     <w:p>
@@ -2926,10 +2749,7 @@
         <w:pStyle w:val="Listaconvietas"/>
       </w:pPr>
       <w:r>
-        <w:t xml:space="preserve">Bloquear cierres incompletos </w:t>
-      </w:r>
-      <w:r>
-        <w:t>y exigir plan de acción cuando corresponda.</w:t>
+        <w:t>Bloquear cierres incompletos y exigir plan de acción cuando corresponda.</w:t>
       </w:r>
     </w:p>
     <w:p>
@@ -2985,10 +2805,7 @@
         <w:pStyle w:val="Listaconvietas"/>
       </w:pPr>
       <w:r>
-        <w:t xml:space="preserve">El mismo insumo produce </w:t>
-      </w:r>
-      <w:r>
-        <w:t>el mismo resultado bajo la misma versión metodológica.</w:t>
+        <w:t>El mismo insumo produce el mismo resultado bajo la misma versión metodológica.</w:t>
       </w:r>
     </w:p>
     <w:p>
@@ -3024,10 +2841,7 @@
         <w:pStyle w:val="Ttulo2"/>
       </w:pPr>
       <w:r>
-        <w:t>Fase 7. Construcción backend y persis</w:t>
-      </w:r>
-      <w:r>
-        <w:t>tencia</w:t>
+        <w:t>Fase 7. Construcción backend y persistencia</w:t>
       </w:r>
     </w:p>
     <w:p>
@@ -3060,10 +2874,7 @@
         <w:pStyle w:val="Listaconvietas"/>
       </w:pPr>
       <w:r>
-        <w:t xml:space="preserve">Implementar transacciones para </w:t>
-      </w:r>
-      <w:r>
-        <w:t>crear matriz, guardar evaluación, calcular, registrar controles y planes.</w:t>
+        <w:t>Implementar transacciones para crear matriz, guardar evaluación, calcular, registrar controles y planes.</w:t>
       </w:r>
     </w:p>
     <w:p>
@@ -3088,10 +2899,7 @@
       </w:pPr>
       <w:r>
         <w:lastRenderedPageBreak/>
-        <w:t>Preparar manejo de concurrencia para evitar cierres o aprobaci</w:t>
-      </w:r>
-      <w:r>
-        <w:t>ones duplicadas.</w:t>
+        <w:t>Preparar manejo de concurrencia para evitar cierres o aprobaciones duplicadas.</w:t>
       </w:r>
     </w:p>
     <w:p>
@@ -3147,10 +2955,7 @@
         <w:pStyle w:val="Listaconvietas"/>
       </w:pPr>
       <w:r>
-        <w:t xml:space="preserve">La API </w:t>
-      </w:r>
-      <w:r>
-        <w:t>compila sin advertencias críticas.</w:t>
+        <w:t>La API compila sin advertencias críticas.</w:t>
       </w:r>
     </w:p>
     <w:p>
@@ -3186,10 +2991,7 @@
         <w:pStyle w:val="Ttulo2"/>
       </w:pPr>
       <w:r>
-        <w:t>Fase 8. Construcción fron</w:t>
-      </w:r>
-      <w:r>
-        <w:t>tend Angular</w:t>
+        <w:t>Fase 8. Construcción frontend Angular</w:t>
       </w:r>
     </w:p>
     <w:p>
@@ -3270,10 +3072,7 @@
         <w:pStyle w:val="Listaconvietas"/>
       </w:pPr>
       <w:r>
-        <w:t>C</w:t>
-      </w:r>
-      <w:r>
-        <w:t>omponentes funcionales del módulo.</w:t>
+        <w:t>Componentes funcionales del módulo.</w:t>
       </w:r>
     </w:p>
     <w:p>
@@ -3313,10 +3112,7 @@
         <w:pStyle w:val="Listaconvietas"/>
       </w:pPr>
       <w:r>
-        <w:t>El usuario no autorizado r</w:t>
-      </w:r>
-      <w:r>
-        <w:t>ecibe redirección o mensaje de acceso denegado.</w:t>
+        <w:t>El usuario no autorizado recibe redirección o mensaje de acceso denegado.</w:t>
       </w:r>
     </w:p>
     <w:p>
@@ -3375,14 +3171,7 @@
           <w:b/>
           <w:color w:val="142334"/>
         </w:rPr>
-        <w:t>Entregar consultas ejecutiva</w:t>
-      </w:r>
-      <w:r>
-        <w:rPr>
-          <w:b/>
-          <w:color w:val="142334"/>
-        </w:rPr>
-        <w:t>s y operativas para seguimiento del riesgo, resultados históricos y evidencias de gestión.</w:t>
+        <w:t>Entregar consultas ejecutivas y operativas para seguimiento del riesgo, resultados históricos y evidencias de gestión.</w:t>
       </w:r>
     </w:p>
     <w:p>
@@ -3414,10 +3203,7 @@
         <w:pStyle w:val="Listaconvietas"/>
       </w:pPr>
       <w:r>
-        <w:t xml:space="preserve">Definir </w:t>
-      </w:r>
-      <w:r>
-        <w:t>exportaciones PDF/Excel auditadas.</w:t>
+        <w:t>Definir exportaciones PDF/Excel auditadas.</w:t>
       </w:r>
     </w:p>
     <w:p>
@@ -3505,10 +3291,7 @@
         <w:pStyle w:val="Listaconvietas"/>
       </w:pPr>
       <w:r>
-        <w:t>Los filtros devuelven resultados consisten</w:t>
-      </w:r>
-      <w:r>
-        <w:t>tes con la base de datos.</w:t>
+        <w:t>Los filtros devuelven resultados consistentes con la base de datos.</w:t>
       </w:r>
     </w:p>
     <w:p>
@@ -3537,14 +3320,7 @@
           <w:b/>
           <w:color w:val="142334"/>
         </w:rPr>
-        <w:t>Asegurar que los riesgos residuales no aceptables generen tratamiento, responsables, fechas compromiso, e</w:t>
-      </w:r>
-      <w:r>
-        <w:rPr>
-          <w:b/>
-          <w:color w:val="142334"/>
-        </w:rPr>
-        <w:t>videncias y trazabilidad.</w:t>
+        <w:t>Asegurar que los riesgos residuales no aceptables generen tratamiento, responsables, fechas compromiso, evidencias y trazabilidad.</w:t>
       </w:r>
     </w:p>
     <w:p>
@@ -3584,10 +3360,7 @@
         <w:pStyle w:val="Listaconvietas"/>
       </w:pPr>
       <w:r>
-        <w:t>Registrar seguimientos y cambios de estad</w:t>
-      </w:r>
-      <w:r>
-        <w:t>o.</w:t>
+        <w:t>Registrar seguimientos y cambios de estado.</w:t>
       </w:r>
     </w:p>
     <w:p>
@@ -3652,10 +3425,7 @@
         <w:pStyle w:val="Listaconvietas"/>
       </w:pPr>
       <w:r>
-        <w:t xml:space="preserve">Todo residual alto o crítico tiene </w:t>
-      </w:r>
-      <w:r>
-        <w:t>plan o justificación aprobada.</w:t>
+        <w:t>Todo residual alto o crítico tiene plan o justificación aprobada.</w:t>
       </w:r>
     </w:p>
     <w:p>
@@ -3691,10 +3461,7 @@
         <w:pStyle w:val="Ttulo2"/>
       </w:pPr>
       <w:r>
-        <w:t>Fase 11. Pruebas integrales y control de calid</w:t>
-      </w:r>
-      <w:r>
-        <w:t>ad</w:t>
+        <w:t>Fase 11. Pruebas integrales y control de calidad</w:t>
       </w:r>
     </w:p>
     <w:p>
@@ -3727,10 +3494,7 @@
         <w:pStyle w:val="Listaconvietas"/>
       </w:pPr>
       <w:r>
-        <w:t>Probar cálculos con escenarios bajo, medio, alto y c</w:t>
-      </w:r>
-      <w:r>
-        <w:t>rítico.</w:t>
+        <w:t>Probar cálculos con escenarios bajo, medio, alto y crítico.</w:t>
       </w:r>
     </w:p>
     <w:p>
@@ -3786,10 +3550,7 @@
         <w:pStyle w:val="Listaconvietas"/>
       </w:pPr>
       <w:r>
-        <w:t>Lista de hallazgos y</w:t>
-      </w:r>
-      <w:r>
-        <w:t xml:space="preserve"> correcciones.</w:t>
+        <w:t>Lista de hallazgos y correcciones.</w:t>
       </w:r>
     </w:p>
     <w:p>
@@ -3841,14 +3602,7 @@
           <w:i/>
           <w:color w:val="595959"/>
         </w:rPr>
-        <w:t>Dependencia principal: M</w:t>
-      </w:r>
-      <w:r>
-        <w:rPr>
-          <w:i/>
-          <w:color w:val="595959"/>
-        </w:rPr>
-        <w:t>ódulo construido en backend, frontend y base de datos.</w:t>
+        <w:t>Dependencia principal: Módulo construido en backend, frontend y base de datos.</w:t>
       </w:r>
     </w:p>
     <w:p>
@@ -3881,10 +3635,7 @@
         <w:pStyle w:val="Listaconvietas"/>
       </w:pPr>
       <w:r>
-        <w:t>Preparar documentación cliente</w:t>
-      </w:r>
-      <w:r>
-        <w:t xml:space="preserve"> y desarrollador separada.</w:t>
+        <w:t>Preparar documentación cliente y desarrollador separada.</w:t>
       </w:r>
     </w:p>
     <w:p>
@@ -3916,10 +3667,7 @@
         <w:pStyle w:val="Listaconvietas"/>
       </w:pPr>
       <w:r>
-        <w:t xml:space="preserve">Emitir acta de cierre del módulo </w:t>
-      </w:r>
-      <w:r>
-        <w:t>cuando el usuario responsable apruebe la versión final.</w:t>
+        <w:t>Emitir acta de cierre del módulo cuando el usuario responsable apruebe la versión final.</w:t>
       </w:r>
     </w:p>
     <w:p>
@@ -3976,10 +3724,7 @@
         <w:pStyle w:val="Listaconvietas"/>
       </w:pPr>
       <w:r>
-        <w:t>La documentación no m</w:t>
-      </w:r>
-      <w:r>
-        <w:t>ezcla audiencias.</w:t>
+        <w:t>La documentación no mezcla audiencias.</w:t>
       </w:r>
     </w:p>
     <w:p>
@@ -4015,10 +3760,7 @@
         <w:pStyle w:val="Ttulo1"/>
       </w:pPr>
       <w:r>
-        <w:t>6. Secuencia</w:t>
-      </w:r>
-      <w:r>
-        <w:t xml:space="preserve"> recomendada de ejecución</w:t>
+        <w:t>6. Secuencia recomendada de ejecución</w:t>
       </w:r>
     </w:p>
     <w:p>
@@ -4050,10 +3792,7 @@
         <w:pStyle w:val="Listaconnmeros"/>
       </w:pPr>
       <w:r>
-        <w:t>Diseñar flujo funcional y pantallas antes de cons</w:t>
-      </w:r>
-      <w:r>
-        <w:t>truir interfaz.</w:t>
+        <w:t>Diseñar flujo funcional y pantallas antes de construir interfaz.</w:t>
       </w:r>
     </w:p>
     <w:p>
@@ -4085,10 +3824,7 @@
         <w:pStyle w:val="Listaconnmeros"/>
       </w:pPr>
       <w:r>
-        <w:t>Ejecutar pruebas integrales, documentar hallazgos y cerrar correccione</w:t>
-      </w:r>
-      <w:r>
-        <w:t>s.</w:t>
+        <w:t>Ejecutar pruebas integrales, documentar hallazgos y cerrar correcciones.</w:t>
       </w:r>
     </w:p>
     <w:p>
@@ -4109,10 +3845,7 @@
     </w:p>
     <w:p>
       <w:r>
-        <w:t>Los endpoints siguientes forman la base mínima para iniciar diseño técnico. La lista puede ampliarse durante la fase de contrato backend, pero no debe eliminar la</w:t>
-      </w:r>
-      <w:r>
-        <w:t xml:space="preserve"> separación entre evaluación, cálculo, controles, planes y reportes.</w:t>
+        <w:t>Los endpoints siguientes forman la base mínima para iniciar diseño técnico. La lista puede ampliarse durante la fase de contrato backend, pero no debe eliminar la separación entre evaluación, cálculo, controles, planes y reportes.</w:t>
       </w:r>
     </w:p>
     <w:tbl>
@@ -4928,14 +4661,7 @@
                 <w:color w:val="1E1E1E"/>
                 <w:sz w:val="18"/>
               </w:rPr>
-              <w:t>/api/matrices-r</w:t>
-            </w:r>
-            <w:r>
-              <w:rPr>
-                <w:color w:val="1E1E1E"/>
-                <w:sz w:val="18"/>
-              </w:rPr>
-              <w:t>iesgos/{id}/aprobar</w:t>
+              <w:t>/api/matrices-riesgos/{id}/aprobar</w:t>
             </w:r>
           </w:p>
         </w:tc>
@@ -5222,14 +4948,7 @@
                 <w:color w:val="1E1E1E"/>
                 <w:sz w:val="18"/>
               </w:rPr>
-              <w:t xml:space="preserve">Modelo metodológico, versión, vigencia, estado y </w:t>
-            </w:r>
-            <w:r>
-              <w:rPr>
-                <w:color w:val="1E1E1E"/>
-                <w:sz w:val="18"/>
-              </w:rPr>
-              <w:t>aprobación.</w:t>
+              <w:t>Modelo metodológico, versión, vigencia, estado y aprobación.</w:t>
             </w:r>
           </w:p>
         </w:tc>
@@ -6051,11 +5770,6 @@
     </w:tbl>
     <w:p>
       <w:pPr>
-        <w:spacing w:after="80"/>
-      </w:pPr>
-    </w:p>
-    <w:p>
-      <w:pPr>
         <w:pStyle w:val="Ttulo1"/>
       </w:pPr>
       <w:r>
@@ -6181,14 +5895,7 @@
                 <w:color w:val="1E1E1E"/>
                 <w:sz w:val="18"/>
               </w:rPr>
-              <w:t xml:space="preserve">No </w:t>
-            </w:r>
-            <w:r>
-              <w:rPr>
-                <w:color w:val="1E1E1E"/>
-                <w:sz w:val="18"/>
-              </w:rPr>
-              <w:t>iniciar cálculo definitivo sin fórmula y escalas aprobadas; trabajar con versión marcada como pendiente cuando aplique.</w:t>
+              <w:t>No iniciar cálculo definitivo sin fórmula y escalas aprobadas; trabajar con versión marcada como pendiente cuando aplique.</w:t>
             </w:r>
           </w:p>
         </w:tc>
@@ -6264,14 +5971,7 @@
                 <w:color w:val="1E1E1E"/>
                 <w:sz w:val="18"/>
               </w:rPr>
-              <w:t>Edición d</w:t>
-            </w:r>
-            <w:r>
-              <w:rPr>
-                <w:color w:val="1E1E1E"/>
-                <w:sz w:val="18"/>
-              </w:rPr>
-              <w:t>e modelos usados</w:t>
+              <w:t>Edición de modelos usados</w:t>
             </w:r>
           </w:p>
         </w:tc>
@@ -6371,14 +6071,7 @@
                 <w:color w:val="1E1E1E"/>
                 <w:sz w:val="18"/>
               </w:rPr>
-              <w:t xml:space="preserve">Datos sensibles en </w:t>
-            </w:r>
-            <w:r>
-              <w:rPr>
-                <w:color w:val="1E1E1E"/>
-                <w:sz w:val="18"/>
-              </w:rPr>
-              <w:t>pruebas</w:t>
+              <w:t>Datos sensibles en pruebas</w:t>
             </w:r>
           </w:p>
         </w:tc>
@@ -6452,15 +6145,7 @@
                 <w:color w:val="1E1E1E"/>
                 <w:sz w:val="18"/>
               </w:rPr>
-              <w:t xml:space="preserve">Mantener DNP como fuente o posible receptor solo cuando exista contrato formal </w:t>
-            </w:r>
-            <w:r>
-              <w:rPr>
-                <w:color w:val="1E1E1E"/>
-                <w:sz w:val="18"/>
-              </w:rPr>
-              <w:lastRenderedPageBreak/>
-              <w:t>y aprobación técnica.</w:t>
+              <w:t>Mantener DNP como fuente o posible receptor solo cuando exista contrato formal y aprobación técnica.</w:t>
             </w:r>
           </w:p>
         </w:tc>
@@ -6468,18 +6153,13 @@
     </w:tbl>
     <w:p>
       <w:pPr>
-        <w:spacing w:after="80"/>
-      </w:pPr>
-    </w:p>
-    <w:p>
-      <w:pPr>
         <w:pStyle w:val="Ttulo1"/>
       </w:pPr>
-      <w:r>
-        <w:t>10. Criteri</w:t>
-      </w:r>
-      <w:r>
-        <w:t>os globales de cierre del módulo</w:t>
+      <w:bookmarkStart w:id="0" w:name="_GoBack"/>
+      <w:bookmarkEnd w:id="0"/>
+      <w:r>
+        <w:lastRenderedPageBreak/>
+        <w:t>10. Criterios globales de cierre del módulo</w:t>
       </w:r>
     </w:p>
     <w:p>
@@ -6503,10 +6183,7 @@
         <w:pStyle w:val="Listaconvietas"/>
       </w:pPr>
       <w:r>
-        <w:t>El cálculo de riesgo inherente, c</w:t>
-      </w:r>
-      <w:r>
-        <w:t>ontroles y riesgo residual se ejecuta en backend y deja snapshot auditable.</w:t>
+        <w:t>El cálculo de riesgo inherente, controles y riesgo residual se ejecuta en backend y deja snapshot auditable.</w:t>
       </w:r>
     </w:p>
     <w:p>
@@ -6522,10 +6199,7 @@
         <w:pStyle w:val="Listaconvietas"/>
       </w:pPr>
       <w:r>
-        <w:t xml:space="preserve">Los planes de acción son obligatorios para residuales altos o críticos, salvo justificación </w:t>
-      </w:r>
-      <w:r>
-        <w:t>aprobada.</w:t>
+        <w:t>Los planes de acción son obligatorios para residuales altos o críticos, salvo justificación aprobada.</w:t>
       </w:r>
     </w:p>
     <w:p>
@@ -6729,14 +6403,7 @@
                 <w:color w:val="1E1E1E"/>
                 <w:sz w:val="18"/>
               </w:rPr>
-              <w:t xml:space="preserve">Factores, criterios, escalas y pesos tienen responsable de </w:t>
-            </w:r>
-            <w:r>
-              <w:rPr>
-                <w:color w:val="1E1E1E"/>
-                <w:sz w:val="18"/>
-              </w:rPr>
-              <w:t>aprobación.</w:t>
+              <w:t>Factores, criterios, escalas y pesos tienen responsable de aprobación.</w:t>
             </w:r>
           </w:p>
         </w:tc>
@@ -6936,14 +6603,7 @@
                 <w:color w:val="1E1E1E"/>
                 <w:sz w:val="18"/>
               </w:rPr>
-              <w:t>Cliente y desarrollad</w:t>
-            </w:r>
-            <w:r>
-              <w:rPr>
-                <w:color w:val="1E1E1E"/>
-                <w:sz w:val="18"/>
-              </w:rPr>
-              <w:t>or separados, con versión, fecha, estado y fuente.</w:t>
+              <w:t>Cliente y desarrollador separados, con versión, fecha, estado y fuente.</w:t>
             </w:r>
           </w:p>
         </w:tc>
@@ -7058,14 +6718,7 @@
                 <w:color w:val="2D2D2D"/>
                 <w:sz w:val="20"/>
               </w:rPr>
-              <w:t>Al completar estas fases, el Módulo 3. Matrices de Riesgos quedará preparado para operar como componente central de medición,</w:t>
-            </w:r>
-            <w:r>
-              <w:rPr>
-                <w:color w:val="2D2D2D"/>
-                <w:sz w:val="20"/>
-              </w:rPr>
-              <w:t xml:space="preserve"> tratamiento, seguimiento y explicación del riesgo LAFT dentro del sistema institucional.</w:t>
+              <w:t>Al completar estas fases, el Módulo 3. Matrices de Riesgos quedará preparado para operar como componente central de medición, tratamiento, seguimiento y explicación del riesgo LAFT dentro del sistema institucional.</w:t>
             </w:r>
           </w:p>
         </w:tc>
@@ -19775,7 +19428,7 @@
 </file>
 
 <file path=customXml/itemProps1.xml><?xml version="1.0" encoding="utf-8"?>
-<ds:datastoreItem xmlns:ds="http://schemas.openxmlformats.org/officeDocument/2006/customXml" ds:itemID="{C9C5939A-05D3-440E-B438-1BC6D19FDB02}">
+<ds:datastoreItem xmlns:ds="http://schemas.openxmlformats.org/officeDocument/2006/customXml" ds:itemID="{84A8E550-AF6B-4460-A872-F2B075F6F474}">
   <ds:schemaRefs>
     <ds:schemaRef ds:uri="http://schemas.openxmlformats.org/officeDocument/2006/bibliography"/>
   </ds:schemaRefs>

</xml_diff>